<commit_message>
corrección contrato vigencia e incremento IPC
</commit_message>
<xml_diff>
--- a/docs/Contrato_Licencia_Uso_ClaraCore.docx
+++ b/docs/Contrato_Licencia_Uso_ClaraCore.docx
@@ -426,7 +426,7 @@
           <w:sz w:val="24"/>
           <w:szCs w:val="24"/>
         </w:rPr>
-        <w:t xml:space="preserve">) más IVA, por contrato u obra activa en la plataforma.</w:t>
+        <w:t xml:space="preserve">) más IVA, por contrato u obra activa en la plataforma. El valor mensual de la licencia se ajustará anualmente el 1 de enero de cada año, en un porcentaje igual a la variación del IPC certificado por el DANE para el año inmediatamente anterior, sin que se requiera notificación previa.</w:t>
       </w:r>
     </w:p>
     <w:p>
@@ -1095,7 +1095,7 @@
           <w:sz w:val="24"/>
           <w:szCs w:val="24"/>
         </w:rPr>
-        <w:t xml:space="preserve">El presente contrato rige desde su firma y tendrá una duración igual a la del contrato u obra identificado en la Cláusula 1, renovándose de manera automática por períodos mensuales mientras subsista la ejecución. Cualquiera de las partes podrá terminarlo mediante aviso escrito notificado antes del inicio del siguiente período mensual de facturación, sin que haya lugar a indemnización, sin perjuicio del pago de los valores causados. Si el aviso se notifica una vez iniciado el período mensual, el contrato terminará al cierre de dicho período, causándose el valor completo del mes en curso.</w:t>
+        <w:t xml:space="preserve">El presente contrato rige desde el {{FECHA_INICIO}} y tendrá una duración igual a la del contrato u obra identificado en la Cláusula 1, renovándose de manera automática por períodos mensuales mientras subsista la ejecución. Cualquiera de las partes podrá terminarlo mediante aviso escrito notificado antes del inicio del siguiente período mensual de facturación, sin que haya lugar a indemnización, sin perjuicio del pago de los valores causados. Si el aviso se notifica una vez iniciado el período mensual, el contrato terminará al cierre de dicho período, causándose el valor completo del mes en curso.</w:t>
       </w:r>
     </w:p>
     <w:p>

</xml_diff>